<commit_message>
Spellingsaanpassing in handleiding, teamsreflectie afgerond.
</commit_message>
<xml_diff>
--- a/Teamsreflectie.docx
+++ b/Teamsreflectie.docx
@@ -118,6 +118,11 @@
       </w:pPr>
       <w:r>
         <w:t xml:space="preserve">Blij dat wij rekening hebben gehouden met het lagere budget. </w:t>
+      </w:r>
+    </w:p>
+    <w:p>
+      <w:r>
+        <w:t>Verder hadden wij ook nog opmerkingen gekregen van niet onze opdrachtgever, maar ook de eigenares die aanwezig was bij de eindpresentatie. We hebben complimenten gekregen over hoe we de vragen beantwoord hebben en hoe wij ons idee tentoongesteld hebben</w:t>
       </w:r>
     </w:p>
     <w:p>

</xml_diff>